<commit_message>
Add RIR instrumentation and calibration protocol to Rena Paul's program
</commit_message>
<xml_diff>
--- a/clients/rena_paul/Rena_Paul_2Day_Training_Plan.docx
+++ b/clients/rena_paul/Rena_Paul_2Day_Training_Plan.docx
@@ -2606,6 +2606,31 @@
           <w:szCs w:val="17"/>
         </w:rPr>
         <w:t xml:space="preserve">Rena tested well above typical new-client baselines: 85 lb Hex Deadlift and 85 lb Hip Thrust for 5 reps each, a 2:00 plank hold, and 5 reps per grip on assisted pull-ups (close, standard, and wide). This program starts her at meaningful working loads rather than conservative ones — the evidence is clear that women are systematically under-loaded in most programs, and her baseline does not call for a cautious ramp-up.</w:t>
+      </w:r>
+    </w:p>
+    <w:p>
+      <w:pPr>
+        <w:spacing w:after="100"/>
+      </w:pPr>
+      <w:r>
+        <w:rPr>
+          <w:rFonts w:ascii="Arial" w:cs="Arial" w:eastAsia="Arial" w:hAnsi="Arial"/>
+          <w:b/>
+          <w:bCs/>
+          <w:color w:val="C9A227"/>
+          <w:sz w:val="17"/>
+          <w:szCs w:val="17"/>
+        </w:rPr>
+        <w:t xml:space="preserve">How Hard Each Set Should Feel — Reps In Reserve (RIR):  </w:t>
+      </w:r>
+      <w:r>
+        <w:rPr>
+          <w:rFonts w:ascii="Arial" w:cs="Arial" w:eastAsia="Arial" w:hAnsi="Arial"/>
+          <w:color w:val="2C2C2C"/>
+          <w:sz w:val="17"/>
+          <w:szCs w:val="17"/>
+        </w:rPr>
+        <w:t xml:space="preserve">Every working set in this program carries an RIR target — the number of clean reps you could still have completed at the moment you racked the weight. 2 RIR is the default on the primary lifts (hex deadlift, hip thrust, overhead press, incline press, reverse lunge, single-arm row, and the assisted pull-ups): finish each set with two good reps left, not grinding. 1 RIR is used only on the accessory and isolation work where muscle growth rather than peak strength is the goal — lateral raise, incline push-up, tricep dip. 3+ RIR marks everything deliberately sub-maximal: the goblet squat while its first baseline is being set, the face pull, and the metabolic circuit — and there is no meaningful difference between 3, 4 and 5 there, so do not chase a precise number. Training to true failure is not required and is not the goal on any lift in this program. Loaded carries, plank holds and the Pallof press carry no RIR target at all — those are governed by distance, time and bracing quality, not by how many reps are left. Calibration for the first few weeks: on one sub-maximal set of a movement, call out the RIR you believe you have left, then take that set to true failure and compare. Once your call lands within one rep two sessions running, your RIR is reliable enough to drive load increases on its own.</w:t>
       </w:r>
     </w:p>
     <w:p>
@@ -3557,6 +3582,17 @@
               </w:rPr>
               <w:t xml:space="preserve">Hinge hips back to grip, drive floor away, hips and shoulders rise together. Strong baseline — own the pattern before pushing load.</w:t>
             </w:r>
+            <w:r>
+              <w:rPr>
+                <w:rFonts w:ascii="Arial" w:cs="Arial" w:eastAsia="Arial" w:hAnsi="Arial"/>
+                <w:i/>
+                <w:iCs/>
+                <w:color w:val="00695C"/>
+                <w:sz w:val="14"/>
+                <w:szCs w:val="14"/>
+              </w:rPr>
+              <w:t xml:space="preserve">  2 RIR</w:t>
+            </w:r>
           </w:p>
         </w:tc>
       </w:tr>
@@ -3786,6 +3822,17 @@
               </w:rPr>
               <w:t xml:space="preserve">Upper back on bench, drive hips to full extension, squeeze glutes hard at top. Hip-dominant — a direct bone-density investment.</w:t>
             </w:r>
+            <w:r>
+              <w:rPr>
+                <w:rFonts w:ascii="Arial" w:cs="Arial" w:eastAsia="Arial" w:hAnsi="Arial"/>
+                <w:i/>
+                <w:iCs/>
+                <w:color w:val="00695C"/>
+                <w:sz w:val="14"/>
+                <w:szCs w:val="14"/>
+              </w:rPr>
+              <w:t xml:space="preserve">  2 RIR</w:t>
+            </w:r>
           </w:p>
         </w:tc>
       </w:tr>
@@ -4014,6 +4061,17 @@
                 <w:szCs w:val="17"/>
               </w:rPr>
               <w:t xml:space="preserve">Lateral delt. Arms slightly bent. Raise to shoulder height, 1-second hold at top, slow 2-second lower.</w:t>
+            </w:r>
+            <w:r>
+              <w:rPr>
+                <w:rFonts w:ascii="Arial" w:cs="Arial" w:eastAsia="Arial" w:hAnsi="Arial"/>
+                <w:i/>
+                <w:iCs/>
+                <w:color w:val="00695C"/>
+                <w:sz w:val="14"/>
+                <w:szCs w:val="14"/>
+              </w:rPr>
+              <w:t xml:space="preserve">  1 RIR — hypertrophy-priority isolation</w:t>
             </w:r>
           </w:p>
         </w:tc>
@@ -4559,6 +4617,17 @@
               </w:rPr>
               <w:t xml:space="preserve">Baseline 15 lbs ×5RM. Seated: back supported, spine neutral. Press overhead, arms alongside ears. Core braced throughout.</w:t>
             </w:r>
+            <w:r>
+              <w:rPr>
+                <w:rFonts w:ascii="Arial" w:cs="Arial" w:eastAsia="Arial" w:hAnsi="Arial"/>
+                <w:i/>
+                <w:iCs/>
+                <w:color w:val="00695C"/>
+                <w:sz w:val="14"/>
+                <w:szCs w:val="14"/>
+              </w:rPr>
+              <w:t xml:space="preserve">  2 RIR</w:t>
+            </w:r>
           </w:p>
         </w:tc>
       </w:tr>
@@ -4788,6 +4857,17 @@
               </w:rPr>
               <w:t xml:space="preserve">Baseline 20 lbs ×5RM. 30–45° incline. Full range, control the descent, drive up without arching off the bench.</w:t>
             </w:r>
+            <w:r>
+              <w:rPr>
+                <w:rFonts w:ascii="Arial" w:cs="Arial" w:eastAsia="Arial" w:hAnsi="Arial"/>
+                <w:i/>
+                <w:iCs/>
+                <w:color w:val="00695C"/>
+                <w:sz w:val="14"/>
+                <w:szCs w:val="14"/>
+              </w:rPr>
+              <w:t xml:space="preserve">  2 RIR</w:t>
+            </w:r>
           </w:p>
         </w:tc>
       </w:tr>
@@ -5016,6 +5096,17 @@
                 <w:szCs w:val="17"/>
               </w:rPr>
               <w:t xml:space="preserve">Baseline 25 lbs ×8. Slight knee bend, hinge from hip, feel hamstring load. Left and right equal sets — builds hip hinge control unilaterally.</w:t>
+            </w:r>
+            <w:r>
+              <w:rPr>
+                <w:rFonts w:ascii="Arial" w:cs="Arial" w:eastAsia="Arial" w:hAnsi="Arial"/>
+                <w:i/>
+                <w:iCs/>
+                <w:color w:val="00695C"/>
+                <w:sz w:val="14"/>
+                <w:szCs w:val="14"/>
+              </w:rPr>
+              <w:t xml:space="preserve">  2 RIR — balance is the limiter here, not fatigue</w:t>
             </w:r>
           </w:p>
         </w:tc>
@@ -7657,6 +7748,17 @@
               </w:rPr>
               <w:t xml:space="preserve">Baseline 25 lbs ×5RM. Step back with control, front knee tracks over toes, drive through the front heel to stand.</w:t>
             </w:r>
+            <w:r>
+              <w:rPr>
+                <w:rFonts w:ascii="Arial" w:cs="Arial" w:eastAsia="Arial" w:hAnsi="Arial"/>
+                <w:i/>
+                <w:iCs/>
+                <w:color w:val="00695C"/>
+                <w:sz w:val="14"/>
+                <w:szCs w:val="14"/>
+              </w:rPr>
+              <w:t xml:space="preserve">  2 RIR</w:t>
+            </w:r>
           </w:p>
         </w:tc>
       </w:tr>
@@ -7886,6 +7988,17 @@
               </w:rPr>
               <w:t xml:space="preserve">Not tested — establishing baseline. DB held at chest. Full depth, chest tall, elbows inside knees at bottom.</w:t>
             </w:r>
+            <w:r>
+              <w:rPr>
+                <w:rFonts w:ascii="Arial" w:cs="Arial" w:eastAsia="Arial" w:hAnsi="Arial"/>
+                <w:i/>
+                <w:iCs/>
+                <w:color w:val="00695C"/>
+                <w:sz w:val="14"/>
+                <w:szCs w:val="14"/>
+              </w:rPr>
+              <w:t xml:space="preserve">  3+ RIR — new baseline, technique first</w:t>
+            </w:r>
           </w:p>
         </w:tc>
       </w:tr>
@@ -8114,6 +8227,17 @@
                 <w:szCs w:val="17"/>
               </w:rPr>
               <w:t xml:space="preserve">Pull to face, elbows at ear height, external rotation at end range. Balances the pressing volume from Day A.</w:t>
+            </w:r>
+            <w:r>
+              <w:rPr>
+                <w:rFonts w:ascii="Arial" w:cs="Arial" w:eastAsia="Arial" w:hAnsi="Arial"/>
+                <w:i/>
+                <w:iCs/>
+                <w:color w:val="00695C"/>
+                <w:sz w:val="14"/>
+                <w:szCs w:val="14"/>
+              </w:rPr>
+              <w:t xml:space="preserve">  3+ RIR — shoulder health, quality over load</w:t>
             </w:r>
           </w:p>
         </w:tc>
@@ -8659,6 +8783,17 @@
               </w:rPr>
               <w:t xml:space="preserve">LEADS every session. Full hang at bottom, chin over bar at top, controlled 3-second descent. Add 1 rep every 2 weeks.</w:t>
             </w:r>
+            <w:r>
+              <w:rPr>
+                <w:rFonts w:ascii="Arial" w:cs="Arial" w:eastAsia="Arial" w:hAnsi="Arial"/>
+                <w:i/>
+                <w:iCs/>
+                <w:color w:val="00695C"/>
+                <w:sz w:val="14"/>
+                <w:szCs w:val="14"/>
+              </w:rPr>
+              <w:t xml:space="preserve">  2 RIR — set the assist level so this holds</w:t>
+            </w:r>
           </w:p>
         </w:tc>
       </w:tr>
@@ -8888,6 +9023,17 @@
               </w:rPr>
               <w:t xml:space="preserve">Standard overhand grip, shoulder-width. Same quality as close grip. Second grip in the rotation.</w:t>
             </w:r>
+            <w:r>
+              <w:rPr>
+                <w:rFonts w:ascii="Arial" w:cs="Arial" w:eastAsia="Arial" w:hAnsi="Arial"/>
+                <w:i/>
+                <w:iCs/>
+                <w:color w:val="00695C"/>
+                <w:sz w:val="14"/>
+                <w:szCs w:val="14"/>
+              </w:rPr>
+              <w:t xml:space="preserve">  2 RIR</w:t>
+            </w:r>
           </w:p>
         </w:tc>
       </w:tr>
@@ -9117,6 +9263,17 @@
               </w:rPr>
               <w:t xml:space="preserve">Wide overhand grip — greatest lat stretch at bottom, hardest of the three. Full range, no partial reps.</w:t>
             </w:r>
+            <w:r>
+              <w:rPr>
+                <w:rFonts w:ascii="Arial" w:cs="Arial" w:eastAsia="Arial" w:hAnsi="Arial"/>
+                <w:i/>
+                <w:iCs/>
+                <w:color w:val="00695C"/>
+                <w:sz w:val="14"/>
+                <w:szCs w:val="14"/>
+              </w:rPr>
+              <w:t xml:space="preserve">  2 RIR — add assist here if needed</w:t>
+            </w:r>
           </w:p>
         </w:tc>
       </w:tr>
@@ -9346,6 +9503,17 @@
               </w:rPr>
               <w:t xml:space="preserve">Baseline 30 lbs ×5RM. Bench-supported, flat back. Drive elbow to hip, full stretch at bottom.</w:t>
             </w:r>
+            <w:r>
+              <w:rPr>
+                <w:rFonts w:ascii="Arial" w:cs="Arial" w:eastAsia="Arial" w:hAnsi="Arial"/>
+                <w:i/>
+                <w:iCs/>
+                <w:color w:val="00695C"/>
+                <w:sz w:val="14"/>
+                <w:szCs w:val="14"/>
+              </w:rPr>
+              <w:t xml:space="preserve">  2 RIR</w:t>
+            </w:r>
           </w:p>
         </w:tc>
       </w:tr>
@@ -9574,6 +9742,17 @@
                 <w:szCs w:val="17"/>
               </w:rPr>
               <w:t xml:space="preserve">18–20 inch box. Drive through front heel, full hip extension at top. Excellent glute and quad developer without spine loading.</w:t>
+            </w:r>
+            <w:r>
+              <w:rPr>
+                <w:rFonts w:ascii="Arial" w:cs="Arial" w:eastAsia="Arial" w:hAnsi="Arial"/>
+                <w:i/>
+                <w:iCs/>
+                <w:color w:val="00695C"/>
+                <w:sz w:val="14"/>
+                <w:szCs w:val="14"/>
+              </w:rPr>
+              <w:t xml:space="preserve">  2 RIR</w:t>
             </w:r>
           </w:p>
         </w:tc>
@@ -10119,6 +10298,17 @@
               </w:rPr>
               <w:t xml:space="preserve">Baseline 10 reps. Hands on bench or box, full chest to bench level, controlled descent. Progress by lowering the incline height each week.</w:t>
             </w:r>
+            <w:r>
+              <w:rPr>
+                <w:rFonts w:ascii="Arial" w:cs="Arial" w:eastAsia="Arial" w:hAnsi="Arial"/>
+                <w:i/>
+                <w:iCs/>
+                <w:color w:val="00695C"/>
+                <w:sz w:val="14"/>
+                <w:szCs w:val="14"/>
+              </w:rPr>
+              <w:t xml:space="preserve">  1 RIR — hypertrophy-priority accessory</w:t>
+            </w:r>
           </w:p>
         </w:tc>
       </w:tr>
@@ -10348,6 +10538,17 @@
               </w:rPr>
               <w:t xml:space="preserve">Attempt full push-ups, stop 2 reps before form breaks. Neutral spine throughout — no sag or pike.</w:t>
             </w:r>
+            <w:r>
+              <w:rPr>
+                <w:rFonts w:ascii="Arial" w:cs="Arial" w:eastAsia="Arial" w:hAnsi="Arial"/>
+                <w:i/>
+                <w:iCs/>
+                <w:color w:val="00695C"/>
+                <w:sz w:val="14"/>
+                <w:szCs w:val="14"/>
+              </w:rPr>
+              <w:t xml:space="preserve">  2 RIR — form is the limiter, not fatigue</w:t>
+            </w:r>
           </w:p>
         </w:tc>
       </w:tr>
@@ -10576,6 +10777,17 @@
                 <w:szCs w:val="17"/>
               </w:rPr>
               <w:t xml:space="preserve">Hands on bench behind body, lower until elbows reach 90°, drive back up. Complements pressing and push-up volume.</w:t>
+            </w:r>
+            <w:r>
+              <w:rPr>
+                <w:rFonts w:ascii="Arial" w:cs="Arial" w:eastAsia="Arial" w:hAnsi="Arial"/>
+                <w:i/>
+                <w:iCs/>
+                <w:color w:val="00695C"/>
+                <w:sz w:val="14"/>
+                <w:szCs w:val="14"/>
+              </w:rPr>
+              <w:t xml:space="preserve">  1 RIR — hypertrophy-priority isolation</w:t>
             </w:r>
           </w:p>
         </w:tc>
@@ -11121,6 +11333,17 @@
               </w:rPr>
               <w:t xml:space="preserve">Sub-maximal load, continuous reps. Focus is metabolic — keep moving into the next exercise.</w:t>
             </w:r>
+            <w:r>
+              <w:rPr>
+                <w:rFonts w:ascii="Arial" w:cs="Arial" w:eastAsia="Arial" w:hAnsi="Arial"/>
+                <w:i/>
+                <w:iCs/>
+                <w:color w:val="00695C"/>
+                <w:sz w:val="14"/>
+                <w:szCs w:val="14"/>
+              </w:rPr>
+              <w:t xml:space="preserve">  3+ RIR throughout the circuit — metabolic, never near-failure</w:t>
+            </w:r>
           </w:p>
         </w:tc>
       </w:tr>
@@ -11349,6 +11572,17 @@
                 <w:szCs w:val="17"/>
               </w:rPr>
               <w:t xml:space="preserve">Hip hinge, pull both DBs to ribs. Lighter than Day B primary row — metabolic pull volume.</w:t>
+            </w:r>
+            <w:r>
+              <w:rPr>
+                <w:rFonts w:ascii="Arial" w:cs="Arial" w:eastAsia="Arial" w:hAnsi="Arial"/>
+                <w:i/>
+                <w:iCs/>
+                <w:color w:val="00695C"/>
+                <w:sz w:val="14"/>
+                <w:szCs w:val="14"/>
+              </w:rPr>
+              <w:t xml:space="preserve">  3+ RIR</w:t>
             </w:r>
           </w:p>
         </w:tc>

</xml_diff>